<commit_message>
Cursor fluido y sin duplicarse en el visor; la música continúa al apagarla y encenderla
- cursor.js: la posición se aplica una sola vez por cuadro con transform y el
  rastro se anima con la API de animaciones (antes cada movimiento forzaba un
  recálculo de toda la página, y eso trababa el cursor en las secciones pesadas).
  Además se esconde cuando el puntero sale de la ventana.
- El cursor del CV ahora sí se oculta al abrir un proyecto en el visor: el
  selector buscaba los elementos dentro de <body>, pero cuelgan de <html>, así
  que quedaban dos cursores (el del CV congelado encima del proyecto).
- musica.js: al volver a encender con el botón se salta al segundo guardado solo
  si de verdad hace falta; antes ese salto innecesario reiniciaba la canción.
- Versiones nuevas: cursor.js?v=2 y musica.js?v=7; el adelanto de descarga usa
  as='fetch' (ya no deja aviso en la consola).
- .md y documentos Word/PDF (DESIGN_actualizado y Arquitectura-CV) alineados.
</commit_message>
<xml_diff>
--- a/docs/DESIGN_actualizado.docx
+++ b/docs/DESIGN_actualizado.docx
@@ -242,7 +242,7 @@
           <w:b w:val="0"/>
           <w:sz w:val="22"/>
         </w:rPr>
-        <w:t>El ícono de la marca como cursor, favicon, marcos de fotografías y separadores. El cursor deja un rastro azul de baja opacidad y también funciona en pantallas táctiles.</w:t>
+        <w:t>El ícono de la marca como cursor, favicon, marcos de fotografías y separadores. El cursor deja un rastro azul de baja opacidad y también funciona en pantallas táctiles. El cursor se mueve fluido y se esconde cuando el puntero sale de la ventana y mientras un proyecto se abre en el visor, para no duplicarse con el del proyecto.</w:t>
       </w:r>
     </w:p>
     <w:p>
@@ -1250,7 +1250,7 @@
           <w:b w:val="0"/>
           <w:sz w:val="22"/>
         </w:rPr>
-        <w:t>Es un pill en el header, en acento Borel. Apagado va en amarillo con texto marino; encendido, en rojo con texto blanco. Es el único control de la música: la música vive en el CV y las carpetas de proyecto se abren dentro de él, así que al entrar y salir de un proyecto sigue en el mismo segundo, sin cortes ni reinicios. El botón del header del proyecto controla esa misma música. Si el navegador bloquea el sonido, suena con el primer gesto.</w:t>
+        <w:t>Es un pill en el header, en acento Borel. Apagado va en amarillo con texto marino; encendido, en rojo con texto blanco. Es el único control de la música: la música vive en el CV y las carpetas de proyecto se abren dentro de él, así que al entrar y salir de un proyecto sigue en el mismo segundo, sin cortes ni reinicios, y al apagarla y volver a encenderla continúa justo en el segundo en que quedó. El botón del header del proyecto controla esa misma música. Si el navegador bloquea el sonido, suena con el primer gesto.</w:t>
       </w:r>
     </w:p>
     <w:p>

</xml_diff>